<commit_message>
Fill the original scheme form without rewriting its labels.
Answers sit in the blank slots, the author line names Beka Tevdorashvili, and the same file is also saved as lesson/sqema.docx.

Co-authored-by: Beka Tevdorashvili <bekatev@users.noreply.github.com>
</commit_message>
<xml_diff>
--- a/lesson/sqema-shevsebuli.docx
+++ b/lesson/sqema-shevsebuli.docx
@@ -135,12 +135,83 @@
       </w:pPr>
       <w:r>
         <w:rPr>
-          <w:rFonts w:ascii="Sylfaen" w:hAnsi="Sylfaen" w:cs="Sylfaen" w:eastAsia="Sylfaen"/>
+          <w:rFonts w:ascii="Sylfaen" w:hAnsi="Sylfaen" w:cs="Sylfaen"/>
           <w:b/>
-          <w:color w:val="1C2430"/>
-          <w:sz w:val="28"/>
-        </w:rPr>
-        <w:t>გეგმის ავტორი: ბექა თევდორაშვილი, მათემატიკის მასწავლებელი</w:t>
+          <w:sz w:val="28"/>
+          <w:szCs w:val="28"/>
+          <w:lang w:val="ka-GE"/>
+        </w:rPr>
+        <w:t xml:space="preserve">გეგმის </w:t>
+      </w:r>
+      <w:r>
+        <w:rPr>
+          <w:rFonts w:ascii="Sylfaen" w:hAnsi="Sylfaen" w:cs="Sylfaen"/>
+          <w:b/>
+          <w:sz w:val="28"/>
+          <w:szCs w:val="28"/>
+        </w:rPr>
+        <w:t>ავტორი</w:t>
+      </w:r>
+      <w:r>
+        <w:rPr>
+          <w:rFonts w:ascii="Sylfaen" w:hAnsi="Sylfaen"/>
+          <w:b/>
+          <w:sz w:val="28"/>
+          <w:szCs w:val="28"/>
+        </w:rPr>
+        <w:t xml:space="preserve">: </w:t>
+      </w:r>
+      <w:r>
+        <w:rPr>
+          <w:rFonts w:ascii="Sylfaen" w:hAnsi="Sylfaen" w:cs="Sylfaen"/>
+          <w:b/>
+          <w:sz w:val="28"/>
+          <w:szCs w:val="28"/>
+        </w:rPr>
+      </w:r>
+      <w:r>
+        <w:rPr>
+          <w:rFonts w:ascii="Sylfaen" w:hAnsi="Sylfaen"/>
+          <w:b/>
+          <w:sz w:val="28"/>
+          <w:szCs w:val="28"/>
+        </w:rPr>
+      </w:r>
+      <w:r>
+        <w:rPr>
+          <w:rFonts w:ascii="Sylfaen" w:hAnsi="Sylfaen" w:cs="Sylfaen"/>
+          <w:b/>
+          <w:sz w:val="28"/>
+          <w:szCs w:val="28"/>
+        </w:rPr>
+        <w:t>მათემატიკის</w:t>
+      </w:r>
+      <w:r>
+        <w:rPr>
+          <w:rFonts w:ascii="Sylfaen" w:hAnsi="Sylfaen"/>
+          <w:b/>
+          <w:sz w:val="28"/>
+          <w:szCs w:val="28"/>
+        </w:rPr>
+        <w:t xml:space="preserve"> </w:t>
+      </w:r>
+      <w:r>
+        <w:rPr>
+          <w:rFonts w:ascii="Sylfaen" w:hAnsi="Sylfaen" w:cs="Sylfaen"/>
+          <w:b/>
+          <w:sz w:val="28"/>
+          <w:szCs w:val="28"/>
+        </w:rPr>
+        <w:t>მასწავლებელი</w:t>
+      </w:r>
+      <w:r>
+        <w:rPr>
+          <w:rFonts w:ascii="Sylfaen" w:hAnsi="Sylfaen"/>
+          <w:b/>
+          <w:sz w:val="28"/>
+          <w:szCs w:val="28"/>
+        </w:rPr>
+        <w:t xml:space="preserve"> ბექა თევდორაშვილი</w:t>
       </w:r>
     </w:p>
     <w:tbl>
@@ -218,7 +289,7 @@
                 <w:rFonts w:ascii="Sylfaen" w:hAnsi="Sylfaen" w:cs="Sylfaen" w:eastAsia="Sylfaen"/>
                 <w:b w:val="0"/>
                 <w:color w:val="1C2430"/>
-                <w:sz w:val="24"/>
+                <w:sz w:val="28"/>
               </w:rPr>
               <w:t>ნატურალური რიცხვების გამრავლების სამი თვისება: გადანაცვლებადობა, ჯუფთებადობა, განრიგებადობა. ერთისა და ნულის კერძო შემთხვევები. საერთო მამრავლის ფრჩხილებს გარეთ გატანა. გამოსახულება, ტოლობა, უტოლობა.</w:t>
             </w:r>
@@ -264,7 +335,7 @@
                 <w:rFonts w:ascii="Sylfaen" w:hAnsi="Sylfaen" w:cs="Sylfaen" w:eastAsia="Sylfaen"/>
                 <w:b w:val="0"/>
                 <w:color w:val="1C2430"/>
-                <w:sz w:val="24"/>
+                <w:sz w:val="28"/>
               </w:rPr>
               <w:t>V</w:t>
             </w:r>
@@ -537,7 +608,7 @@
                 <w:rFonts w:ascii="Sylfaen" w:hAnsi="Sylfaen" w:cs="Sylfaen" w:eastAsia="Sylfaen"/>
                 <w:b w:val="0"/>
                 <w:color w:val="1C2430"/>
-                <w:sz w:val="24"/>
+                <w:sz w:val="28"/>
               </w:rPr>
               <w:t>ერთი გაკვეთილი, დაახლოებით 40 წუთი (ერთი საკლასო პერიოდი). კი, ამ საკითხის ეს ნაწილი ერთ გაკვეთილში სრულდება. I ფაზა მოკლეა, II ფაზა მთავარია, III ფაზა კლასში იწყება სახელმძღვანელოს გვ. 57-ით და საშინაო დავალებით გრძელდება. სამივე ფაზის ბოლომდე გაშლა ერთ 45 წუთში არ დგას მიზნად: ეს ცოდნის აგების ნაბიჯებია, გაკვეთილის სამი თანაბარი ნაწილი კი არა.</w:t>
             </w:r>
@@ -654,7 +725,7 @@
                 <w:rFonts w:ascii="Sylfaen" w:hAnsi="Sylfaen" w:cs="Sylfaen" w:eastAsia="Sylfaen"/>
                 <w:b w:val="0"/>
                 <w:color w:val="1C2430"/>
-                <w:sz w:val="24"/>
+                <w:sz w:val="28"/>
               </w:rPr>
               <w:t>მათ. V.3. მოსწავლეს შეუძლია ნატურალურ რიცხვებზე და ტოლმნიშვნელიან წილადებზე მოქმედებების შესრულება. ამ გაკვეთილზე ჩანს ის ნაწილი, სადაც მოსწავლე ამოცანის კონტექსტის გათვალისწინებით ირჩევს მოქმედების ხერხს და იყენებს გამრავლების თვისებებს. ასოთი ჩანაწერი ებმის V კლასის ალგებრის ბლოკს: ცვლადიანი გამოსახულება, ტოლობა, უტოლობა.</w:t>
             </w:r>
@@ -756,7 +827,7 @@
                 <w:rFonts w:ascii="Sylfaen" w:hAnsi="Sylfaen" w:cs="Sylfaen" w:eastAsia="Sylfaen"/>
                 <w:b w:val="0"/>
                 <w:color w:val="1C2430"/>
-                <w:sz w:val="24"/>
+                <w:sz w:val="28"/>
               </w:rPr>
               <w:t>სახელმძღვანელო, გვ. 56–57. დაფა. რვეული. წყვილის ბარათები (დანართი 1). პროექტორი და სლაიდები: პასუხი და თვისების სახელი დახურულია, სანამ წყვილი თავის ვარაუდს არ იტყვის. დაბალი მზაობის ბარათი, სადაც 5·9 და 5·4 უკვე დათვლილია, და მაღალი მზაობის ბარათი a(b−c)-ზე.</w:t>
             </w:r>
@@ -901,7 +972,7 @@
                 <w:rFonts w:ascii="Sylfaen" w:hAnsi="Sylfaen" w:cs="Sylfaen" w:eastAsia="Sylfaen"/>
                 <w:b w:val="0"/>
                 <w:color w:val="1C2430"/>
-                <w:sz w:val="24"/>
+                <w:sz w:val="28"/>
               </w:rPr>
               <w:t>გამრავლება როგორც განმეორებითი შეკრება. ერთნიშნა რიცხვების გამრავლება. ფრჩხილში ჩაწერილი მოქმედების ჯერ შესრულება. შედარება ნიშნებით &gt; და &lt;. სიტყვიერი პირობის ორ მოკლე ჩანაწერად გადატანა.</w:t>
             </w:r>
@@ -1063,7 +1134,7 @@
                 <w:rFonts w:ascii="Sylfaen" w:hAnsi="Sylfaen" w:cs="Sylfaen" w:eastAsia="Sylfaen"/>
                 <w:b w:val="0"/>
                 <w:color w:val="1C2430"/>
-                <w:sz w:val="24"/>
+                <w:sz w:val="28"/>
               </w:rPr>
               <w:t>მოსწავლემ ორი ანგარიშის შედარებით დაინახოს გამრავლების სამი თვისება — გადანაცვლებადობა, ჯუფთებადობა და განრიგებადობა — დაასახელოს ისინი და ჩაწეროს ასოთი. ცალკე გაარჩიოს, რომ 8a გამოსახულებაა, 8a=56 ტოლობაა, 8a&gt;50 კი უტოლობაა. ერთზე გამრავლება რიცხვს არ ცვლის, ნულზე გამრავლება ნულს იძლევა; ეს კერძო შემთხვევაა და სამ თვისებაში არ შედის.</w:t>
             </w:r>
@@ -1297,7 +1368,7 @@
                 <w:rFonts w:ascii="Sylfaen" w:hAnsi="Sylfaen" w:cs="Sylfaen" w:eastAsia="Sylfaen"/>
                 <w:b w:val="0"/>
                 <w:color w:val="1C2430"/>
-                <w:sz w:val="24"/>
+                <w:sz w:val="28"/>
               </w:rPr>
               <w:t>მამრავლი და ნამრავლი. სამი სახელი: გადანაცვლებადობის, ჯუფთებადობისა და განრიგებადობის თვისება. ჩანაწერები a·b=b·a, (a·b)·c=a·(b·c), a(b+c)=ab+ac და (b+c)·a=ba+ca. ერთზე გამრავლება რიცხვს არ ცვლის. 0·a=0. 8a იგივეა, რაც 8·a. 7(a+c) და (a+c)·7 ერთი და იგივე ჩანაწერია.</w:t>
             </w:r>
@@ -1469,7 +1540,7 @@
                 <w:rFonts w:ascii="Sylfaen" w:hAnsi="Sylfaen" w:cs="Sylfaen" w:eastAsia="Sylfaen"/>
                 <w:b w:val="0"/>
                 <w:color w:val="1C2430"/>
-                <w:sz w:val="24"/>
+                <w:sz w:val="28"/>
               </w:rPr>
               <w:t>თვისება ჯერ ორი გზის შედარებიდან ჩანს, სახელი მერე ერქმევა. 9a+7a=(9+7)a ახალი კანონი არ არის: ეს განრიგებადობაა უკან წაკითხული, საერთო მამრავლის ფრჩხილებს გარეთ გატანა. გამოსახულებას ტოლობის ნიშანი არ აქვს, ტოლობას აქვს =, უტოლობას აქვს &gt; ან &lt;.</w:t>
             </w:r>
@@ -1642,7 +1713,7 @@
                 <w:rFonts w:ascii="Sylfaen" w:hAnsi="Sylfaen" w:cs="Sylfaen" w:eastAsia="Sylfaen"/>
                 <w:b w:val="0"/>
                 <w:color w:val="1C2430"/>
-                <w:sz w:val="24"/>
+                <w:sz w:val="28"/>
               </w:rPr>
               <w:t>ერთ ამოცანაში ორი გზის არჩევა და შედარება. თვისების დასახელება მიზეზით. 9a+7a-ს გახსნა და a(b−c)=ab−ac. გვ. 57-ის ხუთი კითხვის ამოხსნა. ჩანაწერის სამ სახედ დალაგება. სწორედ ეს სამუშაო ფასდება: პასუხთან ერთად უნდა ჩანდეს მიზეზი. ქულა ჟურნალში არ გადადის.</w:t>
             </w:r>
@@ -1988,7 +2059,7 @@
                 <w:rFonts w:ascii="Sylfaen" w:hAnsi="Sylfaen" w:cs="Sylfaen" w:eastAsia="Sylfaen"/>
                 <w:b w:val="0"/>
                 <w:color w:val="1C2430"/>
-                <w:sz w:val="24"/>
+                <w:sz w:val="28"/>
               </w:rPr>
               <w:t>დაფაზე წერია 4+4+4 და 3·4. ჰეტეროგენული წყვილი ეუბნება ერთმანეთს, რომელი ჩანაწერია მოკლე და რატომ. ვინც ჩერდება, სამჯერ ოთხ თითს ითვლის. მასწავლებელი ისმენს ორ-სამ წყვილს და უკუკავშირს აძლევს საქმეზე: „შენ დაინახე, რომ სამი ოთხეული და 3·4 ერთი რაოდენობაა.“ ქულა არ იწერება. აქედან ჩანს, ვინ არის მზად ასოზე გადასასვლელად და ვის სჭირდება რიცხვითი ბარათი.</w:t>
             </w:r>
@@ -2041,7 +2112,7 @@
                 <w:rFonts w:ascii="Sylfaen" w:hAnsi="Sylfaen" w:cs="Sylfaen" w:eastAsia="Sylfaen"/>
                 <w:b w:val="0"/>
                 <w:color w:val="1C2430"/>
-                <w:sz w:val="24"/>
+                <w:sz w:val="28"/>
               </w:rPr>
               <w:t>0·a-ზე პასუხად a. მასწავლებელი ადარებს 1-ზე გამრავლებას და ეკითხება: ნულს a რამდენჯერ ემატება? თუ კიდევ ჩერდება, მოსწავლე წერს 0+0+0. 7(a+c) თუ გაიხსნა როგორც 7a+c, ჯერ რიცხვით ბრუნდებიან: 7·(2+3)=14+21, მერე 7a+7c; იგივეა (a+c)·7. 8a თუ წაიკითხა როგორც 8+a, გვერდით იწერება 8·a. გამოსახულებას თუ = დაერთო, კითხვაა, სად არის მეორე მხარე. სანამ მეორე მხარე არ არის, ჩანაწერი გამოსახულებად რჩება. ჯუფთებადობის მაგალითში თუ ფრჩხილში ჯამი ჩაწერა, უბრუნდება (3·4)·5-ს და ეკითხებიან, შიგნით შეკრება წერია თუ გამრავლება.</w:t>
             </w:r>
@@ -2138,12 +2209,106 @@
             </w:pPr>
             <w:r>
               <w:rPr>
-                <w:rFonts w:ascii="Sylfaen" w:hAnsi="Sylfaen" w:cs="Sylfaen" w:eastAsia="Sylfaen"/>
-                <w:b/>
-                <w:color w:val="1C2430"/>
-                <w:sz w:val="24"/>
-              </w:rPr>
-              <w:t>რის დიფერენცირებას მოახდენთ?     შინაარსი — არა     პროცესი — დიახ     პროდუქტი — დიახ</w:t>
+                <w:rFonts w:ascii="Sylfaen" w:hAnsi="Sylfaen" w:cs="Sylfaen"/>
+                <w:b/>
+                <w:bCs/>
+                <w:lang w:val="ka-GE"/>
+              </w:rPr>
+              <w:t>რის</w:t>
+            </w:r>
+            <w:r>
+              <w:rPr>
+                <w:rFonts w:ascii="Sylfaen" w:hAnsi="Sylfaen"/>
+                <w:b/>
+                <w:bCs/>
+                <w:lang w:val="ka-GE"/>
+              </w:rPr>
+              <w:t xml:space="preserve"> </w:t>
+            </w:r>
+            <w:r>
+              <w:rPr>
+                <w:rFonts w:ascii="Sylfaen" w:hAnsi="Sylfaen" w:cs="Sylfaen"/>
+                <w:b/>
+                <w:bCs/>
+                <w:lang w:val="ka-GE"/>
+              </w:rPr>
+              <w:t>დიფერენცირებას</w:t>
+            </w:r>
+            <w:r>
+              <w:rPr>
+                <w:rFonts w:ascii="Sylfaen" w:hAnsi="Sylfaen"/>
+                <w:b/>
+                <w:bCs/>
+                <w:lang w:val="ka-GE"/>
+              </w:rPr>
+              <w:t xml:space="preserve"> </w:t>
+            </w:r>
+            <w:r>
+              <w:rPr>
+                <w:rFonts w:ascii="Sylfaen" w:hAnsi="Sylfaen" w:cs="Sylfaen"/>
+                <w:b/>
+                <w:bCs/>
+                <w:lang w:val="ka-GE"/>
+              </w:rPr>
+              <w:t>მოახდენთ</w:t>
+            </w:r>
+            <w:r>
+              <w:rPr>
+                <w:rFonts w:ascii="Sylfaen" w:hAnsi="Sylfaen"/>
+                <w:b/>
+                <w:bCs/>
+                <w:lang w:val="ka-GE"/>
+              </w:rPr>
+              <w:t xml:space="preserve">?            </w:t>
+            </w:r>
+            <w:r>
+              <w:rPr>
+                <w:rFonts w:ascii="Sylfaen" w:hAnsi="Sylfaen" w:cs="Sylfaen"/>
+                <w:bCs/>
+                <w:lang w:val="ka-GE"/>
+              </w:rPr>
+              <w:t>შინაარსი</w:t>
+            </w:r>
+            <w:r>
+              <w:rPr>
+                <w:rFonts w:ascii="Sylfaen" w:hAnsi="Sylfaen"/>
+                <w:bCs/>
+                <w:lang w:val="ka-GE"/>
+              </w:rPr>
+              <w:t xml:space="preserve">           </w:t>
+            </w:r>
+            <w:r>
+              <w:rPr>
+                <w:rFonts w:ascii="Sylfaen" w:hAnsi="Sylfaen" w:cs="Sylfaen"/>
+                <w:bCs/>
+                <w:lang w:val="ka-GE"/>
+              </w:rPr>
+              <w:t>პროცესი</w:t>
+            </w:r>
+            <w:r>
+              <w:rPr>
+                <w:rFonts w:ascii="Sylfaen" w:hAnsi="Sylfaen"/>
+                <w:bCs/>
+                <w:lang w:val="ka-GE"/>
+              </w:rPr>
+              <w:t xml:space="preserve">      </w:t>
+            </w:r>
+            <w:r>
+              <w:rPr>
+                <w:rFonts w:ascii="Sylfaen" w:hAnsi="Sylfaen" w:cs="Sylfaen"/>
+                <w:bCs/>
+                <w:lang w:val="ka-GE"/>
+              </w:rPr>
+              <w:t>პროდუქტი</w:t>
+            </w:r>
+            <w:r>
+              <w:rPr>
+                <w:rFonts w:ascii="Sylfaen" w:hAnsi="Sylfaen"/>
+                <w:b/>
+                <w:bCs/>
+                <w:lang w:val="ka-GE"/>
+              </w:rPr>
+              <w:t xml:space="preserve">   </w:t>
             </w:r>
           </w:p>
           <w:p>
@@ -2160,9 +2325,9 @@
                 <w:rFonts w:ascii="Sylfaen" w:hAnsi="Sylfaen" w:cs="Sylfaen" w:eastAsia="Sylfaen"/>
                 <w:b w:val="0"/>
                 <w:color w:val="1C2430"/>
-                <w:sz w:val="24"/>
-              </w:rPr>
-              <w:t>მიზანი და ამოცანები ყველასთვის ერთია. იცვლება დახმარება გზაზე და ის, რასაც მოსწავლე ბოლოს აბარებს.</w:t>
+                <w:sz w:val="28"/>
+              </w:rPr>
+              <w:t>პროცესი და პროდუქტი. შინაარსი არ იცვლება: მიზანი და ამოცანები ყველასთვის ერთია. იცვლება დახმარება გზაზე და ის, რასაც მოსწავლე ბოლოს აბარებს.</w:t>
             </w:r>
           </w:p>
           <w:p>
@@ -2301,7 +2466,7 @@
                 <w:rFonts w:ascii="Sylfaen" w:hAnsi="Sylfaen" w:cs="Sylfaen" w:eastAsia="Sylfaen"/>
                 <w:b w:val="0"/>
                 <w:color w:val="1C2430"/>
-                <w:sz w:val="24"/>
+                <w:sz w:val="28"/>
               </w:rPr>
               <w:t>მზაობა ჩანს პირველივე წყვილის საუბრიდან, 4+4+4 და 3·4. დაბალ მზაობას ეძლევა ბარათი, სადაც შეკრება უკვე გახსნილია. საშუალო მზაობა მუშაობს სრულ წყვილის დავალებაზე. მაღალი მზაობა, იგივე ამოცანის შემდეგ, თავად წერს უტოლობას და ხსნის a(b−c)-ს.</w:t>
             </w:r>
@@ -2347,7 +2512,7 @@
                 <w:rFonts w:ascii="Sylfaen" w:hAnsi="Sylfaen" w:cs="Sylfaen" w:eastAsia="Sylfaen"/>
                 <w:b w:val="0"/>
                 <w:color w:val="1C2430"/>
-                <w:sz w:val="24"/>
+                <w:sz w:val="28"/>
               </w:rPr>
               <w:t>წინარე ცოდნა, რვეულების ამოცანა, გადანაცვლებადობა, ყუთების ამოცანა და ასოთი ჩაწერა — ჰეტეროგენული წყვილი. სახელის დარქმევა და ერთისა და ნულის წინადადება — მთელი კლასი. ჯუფთებადობის ორი ანგარიში — კლასი ორ ნაწილად. გვ. 57-ის პირველი კითხვა — წყვილი, დანარჩენი ოთხი — ცალ-ცალკე. სამწევრიანი ჯგუფი მხოლოდ მაშინ, თუ კენტი რაოდენობა დარჩა. ოთხწევრიანი ჯგუფი ამ გაკვეთილზე არ გამოიყენება.</w:t>
             </w:r>
@@ -2441,7 +2606,7 @@
                 <w:rFonts w:ascii="Sylfaen" w:hAnsi="Sylfaen" w:cs="Sylfaen" w:eastAsia="Sylfaen"/>
                 <w:b w:val="0"/>
                 <w:color w:val="1C2430"/>
-                <w:sz w:val="24"/>
+                <w:sz w:val="28"/>
               </w:rPr>
               <w:t>დაბალი მზაობა რჩება 5·9+5·4-ზე და ასოზე მაშინ გადადის, როცა ორი გზა უკვე ერთ რიცხვს იძლევა. პროდუქტი მოკლეა: ორი გზა და 4a+5a. საშუალო მზაობა ასახელებს სამივე თვისებას და გვ. 57-ს მიზეზით წერს. მაღალი მზაობა წერს თავის უტოლობას a-თი და ხსნის a(b−c)-ს. პროდუქტი გრძელია, მიზანი იგივე.</w:t>
             </w:r>
@@ -2594,7 +2759,7 @@
                 <w:rFonts w:ascii="Sylfaen" w:hAnsi="Sylfaen" w:cs="Sylfaen" w:eastAsia="Sylfaen"/>
                 <w:b w:val="0"/>
                 <w:color w:val="1C2430"/>
-                <w:sz w:val="24"/>
+                <w:sz w:val="28"/>
               </w:rPr>
               <w:t>ამ გაკვეთილზე. წყვილი ადარებს 4+4+4-სა და 3·4-ს, მერე რვეულების ამოცანას ორ გზად წერს: „ხუთი მოსწავლიდან თითოეულს 6 რვეული აქვს. სულ რამდენი რვეულია?“ პრაქტიკულად უკვე ხედავენ, რომ ხუთი ექვსეული და 5·6 ერთი რაოდენობაა, სანამ თვისების სახელს გაიგონებენ. მასწავლებელი თითების თვლით ეხმარება იმას, ვინც შეკრებას გამრავლებას ვერ უკავშირებს, და ზეპირ უკუკავშირს იქვე აძლევს.</w:t>
             </w:r>
@@ -3296,7 +3461,7 @@
                 <w:rFonts w:ascii="Sylfaen" w:hAnsi="Sylfaen" w:cs="Sylfaen" w:eastAsia="Sylfaen"/>
                 <w:b w:val="0"/>
                 <w:color w:val="1C2430"/>
-                <w:sz w:val="24"/>
+                <w:sz w:val="28"/>
               </w:rPr>
               <w:t>ამ გაკვეთილზე. მოსწავლეები სამ თვისებას თვითონ აგებენ. ერთი წყვილი ითვლის 6·5-ს, მეორე 5·6-ს, და თავისი სიტყვით ამბობს, რა არ შეიცვალა; მერე ერქმევა გადანაცვლებადობის თვისება, a·b=b·a. კლასის ორი ნაწილი ადარებს (3·4)·5-სა და 3·(4·5)-ს; სახელი ჯუფთებადობის თვისებაა. ყუთების ამოცანაზე წყვილი თვითონ ირჩევს 5·(9+4)-ს ან 5·9+5·4-ს; როცა ორივე 65-ია, ერქმევა განრიგებადობის თვისება, a(b+c)=ab+ac და (b+c)·a=ba+ca. 9a+7a ამავე კანონიდან იწერება, საერთო მამრავლის გატანით. ერთი და ნული აქვე, მაგრამ სამ თვისებაში არ შედის.</w:t>
             </w:r>
@@ -3793,7 +3958,7 @@
                 <w:rFonts w:ascii="Sylfaen" w:hAnsi="Sylfaen" w:cs="Sylfaen" w:eastAsia="Sylfaen"/>
                 <w:b w:val="0"/>
                 <w:color w:val="1C2430"/>
-                <w:sz w:val="24"/>
+                <w:sz w:val="28"/>
               </w:rPr>
               <w:t>ამ გაკვეთილზე იწყება და სახლში გრძელდება. გვ. 57-ის პირველ კითხვას წყვილი ერთად ხსნის და მიზეზს ამბობს, დანარჩენ ოთხს მოსწავლე ცალ-ცალკე წერს. სამი მოსწავლე გაკვეთილს თითო წინადადებით ხურავს. საშინაოა გვ. 57, №1–№5, და ასო a-თი ერთი გამოსახულება, ერთი ტოლობა, ერთი უტოლობა. მომდევნო გაკვეთილის დასაწყისში ეს ჩანაწერები იკითხება: იქ ჩანს, ვინ მივიდა მიზანამდე და ვის სჭირდება კიდევ ერთი სვეტი.</w:t>
             </w:r>
@@ -4544,7 +4709,7 @@
                 <w:rFonts w:ascii="Sylfaen" w:hAnsi="Sylfaen" w:cs="Sylfaen" w:eastAsia="Sylfaen"/>
                 <w:b w:val="0"/>
                 <w:color w:val="1C2430"/>
-                <w:sz w:val="24"/>
+                <w:sz w:val="28"/>
               </w:rPr>
               <w:t>1. რვეულები. მოსწავლეები კითხულობენ კითხვას და წყვილში ორ გზას წერენ. კლასი ადარებს შედეგს. ერთი მოსწავლე ასახელებს მამრავლსა და ნამრავლს.</w:t>
             </w:r>
@@ -4566,7 +4731,7 @@
                 <w:rFonts w:ascii="Sylfaen" w:hAnsi="Sylfaen" w:cs="Sylfaen" w:eastAsia="Sylfaen"/>
                 <w:b w:val="0"/>
                 <w:color w:val="1C2430"/>
-                <w:sz w:val="24"/>
+                <w:sz w:val="28"/>
               </w:rPr>
               <w:t>2. სახელი. მას შემდეგ, რაც წყვილები თავიანთ სიტყვას იტყვიან, მთელი კლასი იმეორებს სახელს და ჩანაწერს. ერთსა და ნულზე ერთად ამბობენ: ერთზე გამრავლება რიცხვს არ ცვლის.</w:t>
             </w:r>
@@ -4588,7 +4753,7 @@
                 <w:rFonts w:ascii="Sylfaen" w:hAnsi="Sylfaen" w:cs="Sylfaen" w:eastAsia="Sylfaen"/>
                 <w:b w:val="0"/>
                 <w:color w:val="1C2430"/>
-                <w:sz w:val="24"/>
+                <w:sz w:val="28"/>
               </w:rPr>
               <w:t>3. დახურვა. სამი მოსწავლე თითო წინადადებას ამბობს თავისი სიტყვით. დანარჩენები რვეულში იმავეს მოკლედ იწერენ.</w:t>
             </w:r>
@@ -4785,7 +4950,7 @@
                 <w:rFonts w:ascii="Sylfaen" w:hAnsi="Sylfaen" w:cs="Sylfaen" w:eastAsia="Sylfaen"/>
                 <w:b w:val="0"/>
                 <w:color w:val="1C2430"/>
-                <w:sz w:val="24"/>
+                <w:sz w:val="28"/>
               </w:rPr>
               <w:t>1. ყუთები. წყვილი თვითონ ირჩევს გზას, ფურცელს მეზობელს აძლევს და ამოწმებს, ერთი რიცხვი გამოვიდა თუ არა.</w:t>
             </w:r>
@@ -4807,7 +4972,7 @@
                 <w:rFonts w:ascii="Sylfaen" w:hAnsi="Sylfaen" w:cs="Sylfaen" w:eastAsia="Sylfaen"/>
                 <w:b w:val="0"/>
                 <w:color w:val="1C2430"/>
-                <w:sz w:val="24"/>
+                <w:sz w:val="28"/>
               </w:rPr>
               <w:t>2. ორი ბარათი. დაბალი მზაობა მხოლოდ კრებს უკვე დათვლილ 45-სა და 20-ს. მაღალი მზაობა წერს თავის უტოლობას და ხსნის a(b−c)-ს. გვ. 57-ის ოთხი კითხვა ცალ-ცალკე იწერება, მიზეზით.</w:t>
             </w:r>
@@ -4927,83 +5092,262 @@
       </w:pPr>
       <w:r>
         <w:rPr>
+          <w:rFonts w:ascii="Sylfaen" w:eastAsia="Acad Nusx" w:hAnsi="Sylfaen" w:cs="Sylfaen"/>
+          <w:sz w:val="28"/>
+        </w:rPr>
+        <w:t>გაკვეთილის</w:t>
+      </w:r>
+      <w:r>
+        <w:rPr>
+          <w:rFonts w:ascii="Sylfaen" w:eastAsia="Acad Nusx" w:hAnsi="Sylfaen" w:cs="Acad Nusx"/>
+          <w:sz w:val="28"/>
+        </w:rPr>
+        <w:t xml:space="preserve"> </w:t>
+      </w:r>
+      <w:r>
+        <w:rPr>
+          <w:rFonts w:ascii="Sylfaen" w:eastAsia="Acad Nusx" w:hAnsi="Sylfaen" w:cs="Acad Nusx"/>
+          <w:sz w:val="28"/>
+          <w:lang w:val="ka-GE"/>
+        </w:rPr>
+        <w:t xml:space="preserve">დეტალური </w:t>
+      </w:r>
+      <w:r>
+        <w:rPr>
+          <w:rFonts w:ascii="Sylfaen" w:eastAsia="Acad Nusx" w:hAnsi="Sylfaen" w:cs="Sylfaen"/>
+          <w:sz w:val="28"/>
+        </w:rPr>
+        <w:t>გეგმა</w:t>
+      </w:r>
+      <w:r>
+        <w:rPr>
+          <w:rFonts w:ascii="Sylfaen" w:eastAsia="Acad Nusx" w:hAnsi="Sylfaen" w:cs="Acad Nusx"/>
+          <w:sz w:val="28"/>
+        </w:rPr>
+        <w:t>-</w:t>
+      </w:r>
+      <w:r>
+        <w:rPr>
+          <w:rFonts w:ascii="Sylfaen" w:eastAsia="Acad Nusx" w:hAnsi="Sylfaen" w:cs="Sylfaen"/>
+          <w:sz w:val="28"/>
+        </w:rPr>
+        <w:t>კონსპექტი</w:t>
+      </w:r>
+      <w:r>
+        <w:rPr>
+          <w:rFonts w:ascii="Sylfaen" w:eastAsia="Acad Nusx" w:hAnsi="Sylfaen" w:cs="Sylfaen"/>
+          <w:sz w:val="28"/>
+          <w:lang w:val="ka-GE"/>
+        </w:rPr>
+        <w:t xml:space="preserve"> </w:t>
+      </w:r>
+      <w:r>
+        <w:rPr>
+          <w:rFonts w:ascii="Sylfaen" w:eastAsia="Acad Nusx" w:hAnsi="Sylfaen" w:cs="Acad Nusx"/>
+          <w:sz w:val="28"/>
+          <w:lang w:val="ka-GE"/>
+        </w:rPr>
+        <w:t xml:space="preserve">ერთი </w:t>
+      </w:r>
+      <w:r>
+        <w:rPr>
+          <w:rFonts w:ascii="Sylfaen" w:eastAsia="Acad Nusx" w:hAnsi="Sylfaen" w:cs="Acad Nusx"/>
+          <w:sz w:val="28"/>
+        </w:rPr>
+        <w:t xml:space="preserve">45 </w:t>
+      </w:r>
+      <w:r>
+        <w:rPr>
+          <w:rFonts w:ascii="Sylfaen" w:eastAsia="Acad Nusx" w:hAnsi="Sylfaen" w:cs="Sylfaen"/>
+          <w:sz w:val="28"/>
+        </w:rPr>
+        <w:t>წუთიანი</w:t>
+      </w:r>
+      <w:r>
+        <w:rPr>
+          <w:rFonts w:ascii="Sylfaen" w:eastAsia="Acad Nusx" w:hAnsi="Sylfaen" w:cs="Acad Nusx"/>
+          <w:sz w:val="28"/>
+        </w:rPr>
+        <w:t xml:space="preserve"> </w:t>
+      </w:r>
+      <w:r>
+        <w:rPr>
+          <w:rFonts w:ascii="Sylfaen" w:eastAsia="Acad Nusx" w:hAnsi="Sylfaen" w:cs="Sylfaen"/>
+          <w:sz w:val="28"/>
+        </w:rPr>
+        <w:t>გაკვეთილისთვის</w:t>
+      </w:r>
+      <w:r>
+        <w:rPr>
+          <w:rFonts w:ascii="Sylfaen" w:eastAsia="Acad Nusx" w:hAnsi="Sylfaen" w:cs="Acad Nusx"/>
+          <w:sz w:val="28"/>
+        </w:rPr>
+        <w:t xml:space="preserve">, </w:t>
+      </w:r>
+      <w:r>
+        <w:rPr>
+          <w:rFonts w:ascii="Sylfaen" w:eastAsia="Acad Nusx" w:hAnsi="Sylfaen" w:cs="Sylfaen"/>
+          <w:sz w:val="28"/>
+        </w:rPr>
+        <w:t>რომელიც</w:t>
+      </w:r>
+      <w:r>
+        <w:rPr>
+          <w:rFonts w:ascii="Sylfaen" w:eastAsia="Acad Nusx" w:hAnsi="Sylfaen" w:cs="Acad Nusx"/>
+          <w:sz w:val="28"/>
+        </w:rPr>
+        <w:t xml:space="preserve"> </w:t>
+      </w:r>
+      <w:r>
+        <w:rPr>
+          <w:rFonts w:ascii="Sylfaen" w:eastAsia="Acad Nusx" w:hAnsi="Sylfaen" w:cs="Sylfaen"/>
+          <w:sz w:val="28"/>
+        </w:rPr>
+        <w:t>მოიცავს</w:t>
+      </w:r>
+      <w:r>
+        <w:rPr>
+          <w:rFonts w:ascii="Sylfaen" w:eastAsia="Acad Nusx" w:hAnsi="Sylfaen" w:cs="Acad Nusx"/>
+          <w:sz w:val="28"/>
+        </w:rPr>
+        <w:t xml:space="preserve"> I ფაზას, II ფაზას და III ფაზის დასაწყისს</w:t>
+      </w:r>
+      <w:r>
+        <w:rPr>
+          <w:rFonts w:ascii="Sylfaen" w:eastAsia="Acad Nusx" w:hAnsi="Sylfaen" w:cs="Acad Nusx"/>
+          <w:sz w:val="28"/>
+          <w:lang w:val="ka-GE"/>
+        </w:rPr>
+      </w:r>
+      <w:r>
+        <w:rPr>
+          <w:rFonts w:ascii="Sylfaen" w:eastAsia="Acad Nusx" w:hAnsi="Sylfaen" w:cs="Acad Nusx"/>
+          <w:sz w:val="28"/>
+        </w:rPr>
+        <w:t xml:space="preserve"> </w:t>
+      </w:r>
+      <w:r>
+        <w:rPr>
+          <w:rFonts w:ascii="Sylfaen" w:eastAsia="Acad Nusx" w:hAnsi="Sylfaen" w:cs="Sylfaen"/>
+          <w:sz w:val="28"/>
+        </w:rPr>
+      </w:r>
+      <w:r>
+        <w:rPr>
+          <w:rFonts w:ascii="Sylfaen" w:eastAsia="Acad Nusx" w:hAnsi="Sylfaen" w:cs="Acad Nusx"/>
+          <w:sz w:val="28"/>
+        </w:rPr>
+      </w:r>
+      <w:r>
+        <w:rPr>
+          <w:rFonts w:ascii="Sylfaen" w:eastAsia="Acad Nusx" w:hAnsi="Sylfaen" w:cs="Sylfaen"/>
+          <w:sz w:val="28"/>
+        </w:rPr>
+      </w:r>
+    </w:p>
+    <w:p>
+      <w:pPr>
+        <w:rPr>
+          <w:rFonts w:ascii="Sylfaen" w:eastAsia="Acad Nusx" w:hAnsi="Sylfaen" w:cs="Acad Nusx"/>
+          <w:lang w:val="ka-GE"/>
+        </w:rPr>
+      </w:pPr>
+      <w:r>
+        <w:rPr>
+          <w:rFonts w:ascii="Sylfaen" w:eastAsia="Acad Nusx" w:hAnsi="Sylfaen" w:cs="Acad Nusx"/>
+          <w:lang w:val="ka-GE"/>
+        </w:rPr>
+        <w:t>(</w:t>
+      </w:r>
+      <w:r>
+        <w:rPr>
+          <w:rFonts w:ascii="Sylfaen" w:eastAsia="Acad Nusx" w:hAnsi="Sylfaen" w:cs="Acad Nusx"/>
+          <w:lang w:val="ka-GE"/>
+        </w:rPr>
+        <w:t>თხრობითი ტექსტი მესამე პირში</w:t>
+      </w:r>
+      <w:r>
+        <w:rPr>
+          <w:rFonts w:ascii="Sylfaen" w:eastAsia="Acad Nusx" w:hAnsi="Sylfaen" w:cs="Acad Nusx"/>
+          <w:lang w:val="ka-GE"/>
+        </w:rPr>
+        <w:t xml:space="preserve"> -</w:t>
+      </w:r>
+      <w:r>
+        <w:rPr>
+          <w:rFonts w:ascii="Sylfaen" w:eastAsia="Acad Nusx" w:hAnsi="Sylfaen" w:cs="Acad Nusx"/>
+          <w:lang w:val="ka-GE"/>
+        </w:rPr>
+        <w:t xml:space="preserve">კონკრეტული გაკვეთილის მიზნის, საკლასო აქტივობების თანმიმდევრობის, დავალებების არსის, </w:t>
+      </w:r>
+      <w:r>
+        <w:rPr>
+          <w:rFonts w:ascii="Sylfaen" w:eastAsia="Acad Nusx" w:hAnsi="Sylfaen" w:cs="Acad Nusx"/>
+          <w:lang w:val="ka-GE"/>
+        </w:rPr>
+        <w:t>მოსწავლეებისა და მასწავლებლის მოქმედებების</w:t>
+      </w:r>
+      <w:r>
+        <w:rPr>
+          <w:rFonts w:ascii="Sylfaen" w:eastAsia="Acad Nusx" w:hAnsi="Sylfaen" w:cs="Acad Nusx"/>
+          <w:lang w:val="ka-GE"/>
+        </w:rPr>
+        <w:t>, გამოყენებული რესურსების</w:t>
+      </w:r>
+      <w:r>
+        <w:rPr>
+          <w:rFonts w:ascii="Sylfaen" w:eastAsia="Acad Nusx" w:hAnsi="Sylfaen" w:cs="Acad Nusx"/>
+          <w:lang w:val="ka-GE"/>
+        </w:rPr>
+        <w:t xml:space="preserve"> </w:t>
+      </w:r>
+      <w:r>
+        <w:rPr>
+          <w:rFonts w:ascii="Sylfaen" w:eastAsia="Acad Nusx" w:hAnsi="Sylfaen" w:cs="Acad Nusx"/>
+          <w:lang w:val="ka-GE"/>
+        </w:rPr>
+        <w:t xml:space="preserve">მოკლედ და გასაგებად </w:t>
+      </w:r>
+      <w:r>
+        <w:rPr>
+          <w:rFonts w:ascii="Sylfaen" w:eastAsia="Acad Nusx" w:hAnsi="Sylfaen" w:cs="Acad Nusx"/>
+          <w:lang w:val="ka-GE"/>
+        </w:rPr>
+        <w:t>აღწერა ისეთი სიცხადით, რომ სხვა მასწავლებელმა იხელმძღვანელოს და ჩაატაროს მოცემული გაკვეთილი)</w:t>
+      </w:r>
+    </w:p>
+    <w:p>
+      <w:pPr>
+        <w:rPr>
+          <w:rFonts w:ascii="Sylfaen" w:eastAsia="Acad Nusx" w:hAnsi="Sylfaen" w:cs="Acad Nusx"/>
+          <w:sz w:val="28"/>
+        </w:rPr>
+      </w:pPr>
+      <w:r>
+        <w:rPr>
           <w:rFonts w:ascii="Sylfaen" w:hAnsi="Sylfaen" w:cs="Sylfaen" w:eastAsia="Sylfaen"/>
           <w:b w:val="0"/>
           <w:color w:val="1C2430"/>
           <w:sz w:val="28"/>
         </w:rPr>
-        <w:t>გაკვეთილის დეტალური გეგმა-კონსპექტი ერთი 45 წუთიანი გაკვეთილისთვის, რომელიც მოიცავს I ფაზას, II ფაზას და III ფაზის დასაწყისს</w:t>
+        <w:t>გაკვეთილი ერთია, დაახლოებით 40 წუთი. მიზანია, მოსწავლემ შეადაროს ორი ანგარიში, დაინახოს გამრავლების სამი თვისება, ჩაწეროს ისინი ასოთი და გაარჩიოს გამოსახულება, ტოლობა და უტოლობა. რესურსია სახელმძღვანელოს გვ. 56–57, დაფა, რვეული, დანართის ბარათები და სლაიდები, რომლებზეც პასუხი დახურულია.</w:t>
       </w:r>
     </w:p>
     <w:p>
       <w:pPr>
         <w:rPr>
           <w:rFonts w:ascii="Sylfaen" w:eastAsia="Acad Nusx" w:hAnsi="Sylfaen" w:cs="Acad Nusx"/>
-          <w:lang w:val="ka-GE"/>
+          <w:sz w:val="28"/>
         </w:rPr>
       </w:pPr>
       <w:r>
         <w:rPr>
-          <w:rFonts w:ascii="Sylfaen" w:eastAsia="Acad Nusx" w:hAnsi="Sylfaen" w:cs="Acad Nusx"/>
-          <w:lang w:val="ka-GE"/>
-        </w:rPr>
-        <w:t>(</w:t>
-      </w:r>
-      <w:r>
-        <w:rPr>
-          <w:rFonts w:ascii="Sylfaen" w:eastAsia="Acad Nusx" w:hAnsi="Sylfaen" w:cs="Acad Nusx"/>
-          <w:lang w:val="ka-GE"/>
-        </w:rPr>
-        <w:t>თხრობითი ტექსტი მესამე პირში</w:t>
-      </w:r>
-      <w:r>
-        <w:rPr>
-          <w:rFonts w:ascii="Sylfaen" w:eastAsia="Acad Nusx" w:hAnsi="Sylfaen" w:cs="Acad Nusx"/>
-          <w:lang w:val="ka-GE"/>
-        </w:rPr>
-        <w:t xml:space="preserve"> -</w:t>
-      </w:r>
-      <w:r>
-        <w:rPr>
-          <w:rFonts w:ascii="Sylfaen" w:eastAsia="Acad Nusx" w:hAnsi="Sylfaen" w:cs="Acad Nusx"/>
-          <w:lang w:val="ka-GE"/>
-        </w:rPr>
-        <w:t xml:space="preserve">კონკრეტული გაკვეთილის მიზნის, საკლასო აქტივობების თანმიმდევრობის, დავალებების არსის, </w:t>
-      </w:r>
-      <w:r>
-        <w:rPr>
-          <w:rFonts w:ascii="Sylfaen" w:eastAsia="Acad Nusx" w:hAnsi="Sylfaen" w:cs="Acad Nusx"/>
-          <w:lang w:val="ka-GE"/>
-        </w:rPr>
-        <w:t>მოსწავლეებისა და მასწავლებლის მოქმედებების</w:t>
-      </w:r>
-      <w:r>
-        <w:rPr>
-          <w:rFonts w:ascii="Sylfaen" w:eastAsia="Acad Nusx" w:hAnsi="Sylfaen" w:cs="Acad Nusx"/>
-          <w:lang w:val="ka-GE"/>
-        </w:rPr>
-        <w:t>, გამოყენებული რესურსების</w:t>
-      </w:r>
-      <w:r>
-        <w:rPr>
-          <w:rFonts w:ascii="Sylfaen" w:eastAsia="Acad Nusx" w:hAnsi="Sylfaen" w:cs="Acad Nusx"/>
-          <w:lang w:val="ka-GE"/>
-        </w:rPr>
-        <w:t xml:space="preserve"> </w:t>
-      </w:r>
-      <w:r>
-        <w:rPr>
-          <w:rFonts w:ascii="Sylfaen" w:eastAsia="Acad Nusx" w:hAnsi="Sylfaen" w:cs="Acad Nusx"/>
-          <w:lang w:val="ka-GE"/>
-        </w:rPr>
-        <w:t xml:space="preserve">მოკლედ და გასაგებად </w:t>
-      </w:r>
-      <w:r>
-        <w:rPr>
-          <w:rFonts w:ascii="Sylfaen" w:eastAsia="Acad Nusx" w:hAnsi="Sylfaen" w:cs="Acad Nusx"/>
-          <w:lang w:val="ka-GE"/>
-        </w:rPr>
-        <w:t>აღწერა ისეთი სიცხადით, რომ სხვა მასწავლებელმა იხელმძღვანელოს და ჩაატაროს მოცემული გაკვეთილი)</w:t>
+          <w:rFonts w:ascii="Sylfaen" w:hAnsi="Sylfaen" w:cs="Sylfaen" w:eastAsia="Sylfaen"/>
+          <w:b w:val="0"/>
+          <w:color w:val="1C2430"/>
+          <w:sz w:val="28"/>
+        </w:rPr>
+        <w:t>მასწავლებელი გაკვეთილს მზა წესით არ იწყებს. დაფაზე წერს 4+4+4 და 3·4. ჰეტეროგენული წყვილები ერთმანეთს ეუბნებიან, რომელი ჩანაწერია მოკლე. თუ წყვილი ჩერდება, სამჯერ ოთხ თითს ითვლის. როცა ორი წყვილი იტყვის, რომ ორივე 12-ია და გამრავლება აქ მოკლე შეკრებაა, ეს კავშირი დაფაზე რჩება. ქულა არ იწერება. ეს არის წინასწარი შეფასება.</w:t>
       </w:r>
     </w:p>
     <w:p>
@@ -5018,9 +5362,9 @@
           <w:rFonts w:ascii="Sylfaen" w:hAnsi="Sylfaen" w:cs="Sylfaen" w:eastAsia="Sylfaen"/>
           <w:b w:val="0"/>
           <w:color w:val="1C2430"/>
-          <w:sz w:val="24"/>
-        </w:rPr>
-        <w:t>გაკვეთილი ერთია, დაახლოებით 40 წუთი. მიზანია, მოსწავლემ შეადაროს ორი ანგარიში, დაინახოს გამრავლების სამი თვისება, ჩაწეროს ისინი ასოთი და გაარჩიოს გამოსახულება, ტოლობა და უტოლობა. რესურსია სახელმძღვანელოს გვ. 56–57, დაფა, რვეული, დანართის ბარათები და სლაიდები, რომლებზეც პასუხი დახურულია.</w:t>
+          <w:sz w:val="28"/>
+        </w:rPr>
+        <w:t>შემდეგ სლაიდზე მხოლოდ კითხვა ჩანს: „ხუთი მოსწავლიდან თითოეულს 6 რვეული აქვს. სულ რამდენი რვეულია?“ გზები დახურულია. წყვილი ორ ჩანაწერს ეძებს. ვინც მხოლოდ 5·6-ს წერს, მასწავლებელი ეკითხება, ხუთი ექვსეული შეკრებით როგორ დაიწერება. ვინც მხოლოდ ჯამს წერს, ეკითხება, ხუთი ერთნაირი შესაკრები გამრავლებით როგორ მოკლდება. როცა კლასი თანხმდება, რომ ორივე 30-ია, იხსნება პასუხი. ერთი მოსწავლე კითხულობს 5·6=30-ს და ასახელებს მამრავლსა და ნამრავლს.</w:t>
       </w:r>
     </w:p>
     <w:p>
@@ -5035,9 +5379,9 @@
           <w:rFonts w:ascii="Sylfaen" w:hAnsi="Sylfaen" w:cs="Sylfaen" w:eastAsia="Sylfaen"/>
           <w:b w:val="0"/>
           <w:color w:val="1C2430"/>
-          <w:sz w:val="24"/>
-        </w:rPr>
-        <w:t>მასწავლებელი გაკვეთილს მზა წესით არ იწყებს. დაფაზე წერს 4+4+4 და 3·4. ჰეტეროგენული წყვილები ერთმანეთს ეუბნებიან, რომელი ჩანაწერია მოკლე. თუ წყვილი ჩერდება, სამჯერ ოთხ თითს ითვლის. როცა ორი წყვილი იტყვის, რომ ორივე 12-ია და გამრავლება აქ მოკლე შეკრებაა, ეს კავშირი დაფაზე რჩება. ქულა არ იწერება. ეს არის წინასწარი შეფასება.</w:t>
+          <w:sz w:val="28"/>
+        </w:rPr>
+        <w:t>გადანაცვლებადობა. ერთი მაგიდა ითვლის 6·5-ს, მეზობელი 5·6-ს. სლაიდზე ადგილის გაცვლა ჩანს, წესი ჯერ არა. წყვილი ამბობს, რა დარჩა უცვლელი. მხოლოდ ამის შემდეგ იხსნება სახელი: გადანაცვლებადობის თვისება, a·b=b·a. სურვილისამებრ ორი მოსწავლე ადგილსაც იცვლის. კლასი ამოწმებს, რომ ნამრავლი ისევ 30-ია.</w:t>
       </w:r>
     </w:p>
     <w:p>
@@ -5052,9 +5396,9 @@
           <w:rFonts w:ascii="Sylfaen" w:hAnsi="Sylfaen" w:cs="Sylfaen" w:eastAsia="Sylfaen"/>
           <w:b w:val="0"/>
           <w:color w:val="1C2430"/>
-          <w:sz w:val="24"/>
-        </w:rPr>
-        <w:t>შემდეგ სლაიდზე მხოლოდ კითხვა ჩანს: „ხუთი მოსწავლიდან თითოეულს 6 რვეული აქვს. სულ რამდენი რვეულია?“ გზები დახურულია. წყვილი ორ ჩანაწერს ეძებს. ვინც მხოლოდ 5·6-ს წერს, მასწავლებელი ეკითხება, ხუთი ექვსეული შეკრებით როგორ დაიწერება. ვინც მხოლოდ ჯამს წერს, ეკითხება, ხუთი ერთნაირი შესაკრები გამრავლებით როგორ მოკლდება. როცა კლასი თანხმდება, რომ ორივე 30-ია, იხსნება პასუხი. ერთი მოსწავლე კითხულობს 5·6=30-ს და ასახელებს მამრავლსა და ნამრავლს.</w:t>
+          <w:sz w:val="28"/>
+        </w:rPr>
+        <w:t>ერთი და ნული ცალკე დგას. მასწავლებელი პირდაპირ ამბობს, რომ ეს სამი თვისებიდან არც ერთი არ არის. მოსწავლეები ჯერ ხელის აწევით ამბობენ 7·1-სა და 7·0-ს, მერე ამოწმებენ 8·1-ს, 9·0-სა და 0·a-ს. თუ 0·a-ზე ვინმე a-ს იტყვის, მზა პასუხს არ იღებს: ადარებს ერთზე გამრავლებას და წერს, ნულს a რამდენჯერ ემატება. კლასი ერთად ამბობს სრულ წინადადებას: ერთზე გამრავლება რიცხვს არ ცვლის. ნულზე გამრავლება ნულს იძლევა.</w:t>
       </w:r>
     </w:p>
     <w:p>
@@ -5069,9 +5413,9 @@
           <w:rFonts w:ascii="Sylfaen" w:hAnsi="Sylfaen" w:cs="Sylfaen" w:eastAsia="Sylfaen"/>
           <w:b w:val="0"/>
           <w:color w:val="1C2430"/>
-          <w:sz w:val="24"/>
-        </w:rPr>
-        <w:t>გადანაცვლებადობა. ერთი მაგიდა ითვლის 6·5-ს, მეზობელი 5·6-ს. სლაიდზე ადგილის გაცვლა ჩანს, წესი ჯერ არა. წყვილი ამბობს, რა დარჩა უცვლელი. მხოლოდ ამის შემდეგ იხსნება სახელი: გადანაცვლებადობის თვისება, a·b=b·a. სურვილისამებრ ორი მოსწავლე ადგილსაც იცვლის. კლასი ამოწმებს, რომ ნამრავლი ისევ 30-ია.</w:t>
+          <w:sz w:val="28"/>
+        </w:rPr>
+        <w:t>ჯუფთებადობა. კლასი ორად იყოფა. ერთი მხარე ითვლის (3·4)·5=12·5=60, მეორე 3·(4·5)=3·20=60. მოსწავლეები ამბობენ, რომ ფრჩხილის ადგილმა ნამრავლი არ შეცვალა. მაშინ იხსნება სახელი: ჯუფთებადობის თვისება, (a·b)·c=a·(b·c). ერთი მაგალითი საკმარისია. თუ ვინმე ფრჩხილში ჯამს წერს, უბრუნდება ამავე მაგალითს და ეკითხება, შიგნით რა მოქმედება წერია.</w:t>
       </w:r>
     </w:p>
     <w:p>
@@ -5086,9 +5430,9 @@
           <w:rFonts w:ascii="Sylfaen" w:hAnsi="Sylfaen" w:cs="Sylfaen" w:eastAsia="Sylfaen"/>
           <w:b w:val="0"/>
           <w:color w:val="1C2430"/>
-          <w:sz w:val="24"/>
-        </w:rPr>
-        <w:t>ერთი და ნული ცალკე დგას. მასწავლებელი პირდაპირ ამბობს, რომ ეს სამი თვისებიდან არც ერთი არ არის. მოსწავლეები ჯერ ხელის აწევით ამბობენ 7·1-სა და 7·0-ს, მერე ამოწმებენ 8·1-ს, 9·0-სა და 0·a-ს. თუ 0·a-ზე ვინმე a-ს იტყვის, მზა პასუხს არ იღებს: ადარებს ერთზე გამრავლებას და წერს, ნულს a რამდენჯერ ემატება. კლასი ერთად ამბობს სრულ წინადადებას: ერთზე გამრავლება რიცხვს არ ცვლის. ნულზე გამრავლება ნულს იძლევა.</w:t>
+          <w:sz w:val="28"/>
+        </w:rPr>
+        <w:t>განრიგებადობა პრობლემით იწყება. სლაიდზე მხოლოდ ეს ჩანს: ხუთ ყუთში თითოში 9 წითელი და 4 ლურჯი რვეული დევს, სულ რამდენია? წყვილი ირჩევს გზას. დაბალი მზაობის წყვილს ეძლევა ბარათი, სადაც 5·9=45 და 5·4=20 უკვე წერია, და რჩება შეკრებაზე. მაღალი მზაობის წყვილი, როცა ორივე გზით 65 გამოვა, იღებს ბარათს a(b−c)-ზე. როცა ფურცლები გაცვლილია, იხსნება a(b+c)=ab+ac და სახელი: განრიგებადობის თვისება ჯამის მიმართ. გადანაცვლებადობით მარჯვნიდან იწერება (b+c)·a=ba+ca. ერთი მოსწავლე ხსნის 6·(2+3+5)-ს. გამოკლება ერთ ხაზად რჩება: 5·(9−4)=5·9−5·4, ანუ a(b−c)=ab−ac.</w:t>
       </w:r>
     </w:p>
     <w:p>
@@ -5103,9 +5447,9 @@
           <w:rFonts w:ascii="Sylfaen" w:hAnsi="Sylfaen" w:cs="Sylfaen" w:eastAsia="Sylfaen"/>
           <w:b w:val="0"/>
           <w:color w:val="1C2430"/>
-          <w:sz w:val="24"/>
-        </w:rPr>
-        <w:t>ჯუფთებადობა. კლასი ორად იყოფა. ერთი მხარე ითვლის (3·4)·5=12·5=60, მეორე 3·(4·5)=3·20=60. მოსწავლეები ამბობენ, რომ ფრჩხილის ადგილმა ნამრავლი არ შეცვალა. მაშინ იხსნება სახელი: ჯუფთებადობის თვისება, (a·b)·c=a·(b·c). ერთი მაგალითი საკმარისია. თუ ვინმე ფრჩხილში ჯამს წერს, უბრუნდება ამავე მაგალითს და ეკითხება, შიგნით რა მოქმედება წერია.</w:t>
+          <w:sz w:val="28"/>
+        </w:rPr>
+        <w:t>საერთო მამრავლი ამავე კანონიდან გამოდის. დაფაზე გვერდიგვერდ წერია უკვე ნანახი 5·9+5·4=5·(9+4) და კითხვა: „მაშინ 9a+7a რას უდრის?“ წყვილი ეძებს, რა მეორდება ორივე შესაკრებში. როცა იტყვის a-ს, წერს (9+7)a=16a. მასწავლებელი ამ ნაბიჯს არქმევს საერთო მამრავლის ფრჩხილებს გარეთ გატანას. მეორე წყვილი ამბობს 4a+5a-ს, პასუხი მერე იხსნება. შემდეგ წყვილი სიტყვიდან ჩანაწერზე გადადის: „a გამრავლებული 8-ზე“ არის 8a და a·8; „a-სა და c-ს ჯამი, გამრავლებული 7-ზე“ არის 7(a+c) და (a+c)·7; „9a-სა და 7a-ს ჯამი“ არის 9a+7a. სამ სვეტად ალაგებენ 8a-ს, 8a=56-სა და 8a&gt;50-ს. სახელებს — გამოსახულება, ტოლობა, უტოლობა — თვითონ არქმევენ.</w:t>
       </w:r>
     </w:p>
     <w:p>
@@ -5120,41 +5464,7 @@
           <w:rFonts w:ascii="Sylfaen" w:hAnsi="Sylfaen" w:cs="Sylfaen" w:eastAsia="Sylfaen"/>
           <w:b w:val="0"/>
           <w:color w:val="1C2430"/>
-          <w:sz w:val="24"/>
-        </w:rPr>
-        <w:t>განრიგებადობა პრობლემით იწყება. სლაიდზე მხოლოდ ეს ჩანს: ხუთ ყუთში თითოში 9 წითელი და 4 ლურჯი რვეული დევს, სულ რამდენია? წყვილი ირჩევს გზას. დაბალი მზაობის წყვილს ეძლევა ბარათი, სადაც 5·9=45 და 5·4=20 უკვე წერია, და რჩება შეკრებაზე. მაღალი მზაობის წყვილი, როცა ორივე გზით 65 გამოვა, იღებს ბარათს a(b−c)-ზე. როცა ფურცლები გაცვლილია, იხსნება a(b+c)=ab+ac და სახელი: განრიგებადობის თვისება ჯამის მიმართ. გადანაცვლებადობით მარჯვნიდან იწერება (b+c)·a=ba+ca. ერთი მოსწავლე ხსნის 6·(2+3+5)-ს. გამოკლება ერთ ხაზად რჩება: 5·(9−4)=5·9−5·4, ანუ a(b−c)=ab−ac.</w:t>
-      </w:r>
-    </w:p>
-    <w:p>
-      <w:pPr>
-        <w:rPr>
-          <w:rFonts w:ascii="Sylfaen" w:eastAsia="Acad Nusx" w:hAnsi="Sylfaen" w:cs="Acad Nusx"/>
-          <w:sz w:val="28"/>
-        </w:rPr>
-      </w:pPr>
-      <w:r>
-        <w:rPr>
-          <w:rFonts w:ascii="Sylfaen" w:hAnsi="Sylfaen" w:cs="Sylfaen" w:eastAsia="Sylfaen"/>
-          <w:b w:val="0"/>
-          <w:color w:val="1C2430"/>
-          <w:sz w:val="24"/>
-        </w:rPr>
-        <w:t>საერთო მამრავლი ამავე კანონიდან გამოდის. დაფაზე გვერდიგვერდ წერია უკვე ნანახი 5·9+5·4=5·(9+4) და კითხვა: „მაშინ 9a+7a რას უდრის?“ წყვილი ეძებს, რა მეორდება ორივე შესაკრებში. როცა იტყვის a-ს, წერს (9+7)a=16a. მასწავლებელი ამ ნაბიჯს არქმევს საერთო მამრავლის ფრჩხილებს გარეთ გატანას. მეორე წყვილი ამბობს 4a+5a-ს, პასუხი მერე იხსნება. შემდეგ წყვილი სიტყვიდან ჩანაწერზე გადადის: „a გამრავლებული 8-ზე“ არის 8a და a·8; „a-სა და c-ს ჯამი, გამრავლებული 7-ზე“ არის 7(a+c) და (a+c)·7; „9a-სა და 7a-ს ჯამი“ არის 9a+7a. სამ სვეტად ალაგებენ 8a-ს, 8a=56-სა და 8a&gt;50-ს. სახელებს — გამოსახულება, ტოლობა, უტოლობა — თვითონ არქმევენ.</w:t>
-      </w:r>
-    </w:p>
-    <w:p>
-      <w:pPr>
-        <w:rPr>
-          <w:rFonts w:ascii="Sylfaen" w:eastAsia="Acad Nusx" w:hAnsi="Sylfaen" w:cs="Acad Nusx"/>
-          <w:sz w:val="28"/>
-        </w:rPr>
-      </w:pPr>
-      <w:r>
-        <w:rPr>
-          <w:rFonts w:ascii="Sylfaen" w:hAnsi="Sylfaen" w:cs="Sylfaen" w:eastAsia="Sylfaen"/>
-          <w:b w:val="0"/>
-          <w:color w:val="1C2430"/>
-          <w:sz w:val="24"/>
+          <w:sz w:val="28"/>
         </w:rPr>
         <w:t>გვ. 57-ით იწყება დახვეწა. პირველ კითხვას წყვილი ერთად ხსნის. დანარჩენ ოთხს ყველა ცალ-ცალკე წერს და მიზეზს ურთავს: ნულის თვისება, ხუთი ერთნაირი შესაკრები, ან განრიგებადობა. მასწავლებელი დადის და შეცდომას ადგილზე უბრუნებს კითხვით, მზა პასუხს კი არ აწერს. ბოლოს სამი მოსწავლე თითო წინადადებას ამბობს: გადანაცვლებადობას, იმას, რომ ერთზე გამრავლება რიცხვს არ ცვლის, და სამ ჩანაწერს — 8a, 8a=56, 8a&gt;50. საშინაო დაფაზე რჩება: გვ. 57, №1–№5, მიზეზით, და ასო a-თი ერთი გამოსახულება, ერთი ტოლობა, ერთი უტოლობა. მაგალითად 8a, 8a=56, 8a&gt;50.</w:t>
       </w:r>
@@ -5170,29 +5480,55 @@
       </w:pPr>
       <w:r>
         <w:rPr>
+          <w:rFonts w:ascii="Sylfaen" w:eastAsia="Acad Nusx" w:hAnsi="Sylfaen" w:cs="Acad Nusx"/>
+          <w:sz w:val="28"/>
+          <w:lang w:val="ka-GE"/>
+        </w:rPr>
+        <w:t xml:space="preserve">დანართი 1. </w:t>
+      </w:r>
+      <w:r>
+        <w:rPr>
+          <w:rFonts w:ascii="Sylfaen" w:eastAsia="Acad Nusx" w:hAnsi="Sylfaen" w:cs="Acad Nusx"/>
+          <w:sz w:val="28"/>
+          <w:lang w:val="ka-GE"/>
+        </w:rPr>
+        <w:t>ბარათები</w:t>
+      </w:r>
+      <w:r>
+        <w:rPr>
+          <w:rFonts w:ascii="Sylfaen" w:eastAsia="Acad Nusx" w:hAnsi="Sylfaen" w:cs="Acad Nusx"/>
+          <w:sz w:val="28"/>
+          <w:lang w:val="ka-GE"/>
+        </w:rPr>
+        <w:t xml:space="preserve"> (ნახატები, ნახაზები, სქემები, დამხმარე ტექსტები, ბარათები, პოსტერები, თვალსაჩინოებანი და სხვა)</w:t>
+      </w:r>
+    </w:p>
+    <w:p>
+      <w:pPr>
+        <w:rPr>
+          <w:rFonts w:ascii="Sylfaen" w:hAnsi="Sylfaen"/>
+          <w:lang w:val="fi-FI"/>
+        </w:rPr>
+      </w:pPr>
+      <w:r>
+        <w:rPr>
           <w:rFonts w:ascii="Sylfaen" w:hAnsi="Sylfaen" w:cs="Sylfaen" w:eastAsia="Sylfaen"/>
           <w:b w:val="0"/>
           <w:color w:val="1C2430"/>
           <w:sz w:val="28"/>
         </w:rPr>
-        <w:t>დანართი 1. ბარათები (თითო წყვილზე ერთი ბარათი; დაბალი და მაღალი მზაობის ბარათი ცალკეა)</w:t>
+        <w:t>ბარათი 1. რომელი უფრო მოკლეა და რატომ?  4+4+4    და    3·4.</w:t>
       </w:r>
     </w:p>
     <w:p>
-      <w:pPr>
-        <w:rPr>
-          <w:rFonts w:ascii="Sylfaen" w:hAnsi="Sylfaen"/>
-          <w:lang w:val="fi-FI"/>
-        </w:rPr>
-      </w:pPr>
       <w:r>
         <w:rPr>
           <w:rFonts w:ascii="Sylfaen" w:hAnsi="Sylfaen" w:cs="Sylfaen" w:eastAsia="Sylfaen"/>
           <w:b w:val="0"/>
           <w:color w:val="1C2430"/>
-          <w:sz w:val="24"/>
-        </w:rPr>
-        <w:t>ბარათი 1. რომელი უფრო მოკლეა და რატომ?  4+4+4    და    3·4.</w:t>
+          <w:sz w:val="28"/>
+        </w:rPr>
+        <w:t>ბარათი 2. ხუთი მოსწავლიდან თითოეულს 6 რვეული აქვს. სულ რამდენი რვეულია? ჩაწერე ორი გზა.</w:t>
       </w:r>
     </w:p>
     <w:p>
@@ -5201,9 +5537,9 @@
           <w:rFonts w:ascii="Sylfaen" w:hAnsi="Sylfaen" w:cs="Sylfaen" w:eastAsia="Sylfaen"/>
           <w:b w:val="0"/>
           <w:color w:val="1C2430"/>
-          <w:sz w:val="24"/>
-        </w:rPr>
-        <w:t>ბარათი 2. ხუთი მოსწავლიდან თითოეულს 6 რვეული აქვს. სულ რამდენი რვეულია? ჩაწერე ორი გზა.</w:t>
+          <w:sz w:val="28"/>
+        </w:rPr>
+        <w:t>ბარათი 3. ერთმა წყვილმა დათვალოს 6·5, მეორემ 5·6. რა არ შეიცვალა?</w:t>
       </w:r>
     </w:p>
     <w:p>
@@ -5212,9 +5548,9 @@
           <w:rFonts w:ascii="Sylfaen" w:hAnsi="Sylfaen" w:cs="Sylfaen" w:eastAsia="Sylfaen"/>
           <w:b w:val="0"/>
           <w:color w:val="1C2430"/>
-          <w:sz w:val="24"/>
-        </w:rPr>
-        <w:t>ბარათი 3. ერთმა წყვილმა დათვალოს 6·5, მეორემ 5·6. რა არ შეიცვალა?</w:t>
+          <w:sz w:val="28"/>
+        </w:rPr>
+        <w:t>ბარათი 4. ერთმა მხარემ დათვალოს (3·4)·5, მეორემ 3·(4·5). შედეგი შეადარეთ.</w:t>
       </w:r>
     </w:p>
     <w:p>
@@ -5223,9 +5559,9 @@
           <w:rFonts w:ascii="Sylfaen" w:hAnsi="Sylfaen" w:cs="Sylfaen" w:eastAsia="Sylfaen"/>
           <w:b w:val="0"/>
           <w:color w:val="1C2430"/>
-          <w:sz w:val="24"/>
-        </w:rPr>
-        <w:t>ბარათი 4. ერთმა მხარემ დათვალოს (3·4)·5, მეორემ 3·(4·5). შედეგი შეადარეთ.</w:t>
+          <w:sz w:val="28"/>
+        </w:rPr>
+        <w:t>ბარათი 5. 5 ყუთი. თითოში 9 წითელი და 4 ლურჯი რვეულია. სულ რამდენია? ორი გზა ჩაწერე.</w:t>
       </w:r>
     </w:p>
     <w:p>
@@ -5234,9 +5570,9 @@
           <w:rFonts w:ascii="Sylfaen" w:hAnsi="Sylfaen" w:cs="Sylfaen" w:eastAsia="Sylfaen"/>
           <w:b w:val="0"/>
           <w:color w:val="1C2430"/>
-          <w:sz w:val="24"/>
-        </w:rPr>
-        <w:t>ბარათი 5. 5 ყუთი. თითოში 9 წითელი და 4 ლურჯი რვეულია. სულ რამდენია? ორი გზა ჩაწერე.</w:t>
+          <w:sz w:val="28"/>
+        </w:rPr>
+        <w:t>ბარათი 6, დახმარება. 5·9=45 და 5·4=20 უკვე დათვლილია. შეკრიბე. მერე დათვალე 5·(9+4).</w:t>
       </w:r>
     </w:p>
     <w:p>
@@ -5245,9 +5581,9 @@
           <w:rFonts w:ascii="Sylfaen" w:hAnsi="Sylfaen" w:cs="Sylfaen" w:eastAsia="Sylfaen"/>
           <w:b w:val="0"/>
           <w:color w:val="1C2430"/>
-          <w:sz w:val="24"/>
-        </w:rPr>
-        <w:t>ბარათი 6, დახმარება. 5·9=45 და 5·4=20 უკვე დათვლილია. შეკრიბე. მერე დათვალე 5·(9+4).</w:t>
+          <w:sz w:val="28"/>
+        </w:rPr>
+        <w:t>ბარათი 7. დაფაზე წერია 5·9+5·4=5·(9+4). მაშინ 9a+7a რას უდრის?</w:t>
       </w:r>
     </w:p>
     <w:p>
@@ -5256,9 +5592,9 @@
           <w:rFonts w:ascii="Sylfaen" w:hAnsi="Sylfaen" w:cs="Sylfaen" w:eastAsia="Sylfaen"/>
           <w:b w:val="0"/>
           <w:color w:val="1C2430"/>
-          <w:sz w:val="24"/>
-        </w:rPr>
-        <w:t>ბარათი 7. დაფაზე წერია 5·9+5·4=5·(9+4). მაშინ 9a+7a რას უდრის?</w:t>
+          <w:sz w:val="28"/>
+        </w:rPr>
+        <w:t>ბარათი 8, მაღალი მზაობა. დაწერე ერთი უტოლობა a-თი. გახსენი a(b−c).</w:t>
       </w:r>
     </w:p>
     <w:p>
@@ -5267,9 +5603,9 @@
           <w:rFonts w:ascii="Sylfaen" w:hAnsi="Sylfaen" w:cs="Sylfaen" w:eastAsia="Sylfaen"/>
           <w:b w:val="0"/>
           <w:color w:val="1C2430"/>
-          <w:sz w:val="24"/>
-        </w:rPr>
-        <w:t>ბარათი 8, მაღალი მზაობა. დაწერე ერთი უტოლობა a-თი. გახსენი a(b−c).</w:t>
+          <w:sz w:val="28"/>
+        </w:rPr>
+        <w:t>ბარათი 9. სამი სვეტი: გამოსახულება, ტოლობა, უტოლობა. 8a, 8a=56, 8a&gt;50. იგივე გააკეთე 9a+7a-ზე.</w:t>
       </w:r>
     </w:p>
     <w:p>
@@ -5278,18 +5614,7 @@
           <w:rFonts w:ascii="Sylfaen" w:hAnsi="Sylfaen" w:cs="Sylfaen" w:eastAsia="Sylfaen"/>
           <w:b w:val="0"/>
           <w:color w:val="1C2430"/>
-          <w:sz w:val="24"/>
-        </w:rPr>
-        <w:t>ბარათი 9. სამი სვეტი: გამოსახულება, ტოლობა, უტოლობა. 8a, 8a=56, 8a&gt;50. იგივე გააკეთე 9a+7a-ზე.</w:t>
-      </w:r>
-    </w:p>
-    <w:p>
-      <w:r>
-        <w:rPr>
-          <w:rFonts w:ascii="Sylfaen" w:hAnsi="Sylfaen" w:cs="Sylfaen" w:eastAsia="Sylfaen"/>
-          <w:b w:val="0"/>
-          <w:color w:val="1C2430"/>
-          <w:sz w:val="24"/>
+          <w:sz w:val="28"/>
         </w:rPr>
         <w:t>პასუხები, გვ. 57. №1: 0·a=0. №2: 5·27. №3: თუ a=7, 8a=56. №4: თუ a=0, 11a=0. №5: 7(a+c)=7a+7c, იგივეა (a+c)·7.</w:t>
       </w:r>

</xml_diff>